<commit_message>
docs(monitor): update phase 2 and phase 3 reports
</commit_message>
<xml_diff>
--- a/docs/monitor_proj_progress/BÁO CÁO GIAI ĐOẠN 2.docx
+++ b/docs/monitor_proj_progress/BÁO CÁO GIAI ĐOẠN 2.docx
@@ -8519,7 +8519,7 @@
                     <pic:cNvPicPr/>
                   </pic:nvPicPr>
                   <pic:blipFill>
-                    <a:blip r:embed="rId6"/>
+                    <a:blip r:embed="rId8"/>
                     <a:stretch>
                       <a:fillRect/>
                     </a:stretch>
@@ -8624,7 +8624,7 @@
                     <pic:cNvPicPr/>
                   </pic:nvPicPr>
                   <pic:blipFill>
-                    <a:blip r:embed="rId7" cstate="print">
+                    <a:blip r:embed="rId9" cstate="print">
                       <a:extLst>
                         <a:ext uri="{28A0092B-C50C-407E-A947-70E740481C1C}">
                           <a14:useLocalDpi xmlns:a14="http://schemas.microsoft.com/office/drawing/2010/main" val="0"/>
@@ -8873,7 +8873,7 @@
                     <pic:cNvPicPr/>
                   </pic:nvPicPr>
                   <pic:blipFill rotWithShape="1">
-                    <a:blip r:embed="rId8"/>
+                    <a:blip r:embed="rId10"/>
                     <a:srcRect b="9397"/>
                     <a:stretch>
                       <a:fillRect/>
@@ -8987,7 +8987,7 @@
                     <pic:cNvPicPr/>
                   </pic:nvPicPr>
                   <pic:blipFill>
-                    <a:blip r:embed="rId9"/>
+                    <a:blip r:embed="rId11"/>
                     <a:stretch>
                       <a:fillRect/>
                     </a:stretch>
@@ -9313,7 +9313,7 @@
                     <pic:cNvPicPr/>
                   </pic:nvPicPr>
                   <pic:blipFill>
-                    <a:blip r:embed="rId10"/>
+                    <a:blip r:embed="rId12"/>
                     <a:stretch>
                       <a:fillRect/>
                     </a:stretch>
@@ -9425,7 +9425,7 @@
                     <pic:cNvPicPr/>
                   </pic:nvPicPr>
                   <pic:blipFill>
-                    <a:blip r:embed="rId11"/>
+                    <a:blip r:embed="rId13"/>
                     <a:stretch>
                       <a:fillRect/>
                     </a:stretch>
@@ -9706,7 +9706,7 @@
                     <pic:cNvPicPr/>
                   </pic:nvPicPr>
                   <pic:blipFill>
-                    <a:blip r:embed="rId12"/>
+                    <a:blip r:embed="rId14"/>
                     <a:stretch>
                       <a:fillRect/>
                     </a:stretch>
@@ -9811,7 +9811,7 @@
                     <pic:cNvPicPr/>
                   </pic:nvPicPr>
                   <pic:blipFill>
-                    <a:blip r:embed="rId13"/>
+                    <a:blip r:embed="rId15"/>
                     <a:stretch>
                       <a:fillRect/>
                     </a:stretch>
@@ -10072,7 +10072,7 @@
                     <pic:cNvPicPr/>
                   </pic:nvPicPr>
                   <pic:blipFill>
-                    <a:blip r:embed="rId14"/>
+                    <a:blip r:embed="rId16"/>
                     <a:stretch>
                       <a:fillRect/>
                     </a:stretch>
@@ -10178,7 +10178,7 @@
                     <pic:cNvPicPr/>
                   </pic:nvPicPr>
                   <pic:blipFill>
-                    <a:blip r:embed="rId15"/>
+                    <a:blip r:embed="rId17"/>
                     <a:stretch>
                       <a:fillRect/>
                     </a:stretch>
@@ -10412,7 +10412,7 @@
                     <pic:cNvPicPr/>
                   </pic:nvPicPr>
                   <pic:blipFill>
-                    <a:blip r:embed="rId16"/>
+                    <a:blip r:embed="rId18"/>
                     <a:stretch>
                       <a:fillRect/>
                     </a:stretch>
@@ -10517,7 +10517,7 @@
                     <pic:cNvPicPr/>
                   </pic:nvPicPr>
                   <pic:blipFill>
-                    <a:blip r:embed="rId17"/>
+                    <a:blip r:embed="rId19"/>
                     <a:stretch>
                       <a:fillRect/>
                     </a:stretch>
@@ -10865,7 +10865,7 @@
                     <pic:cNvPicPr/>
                   </pic:nvPicPr>
                   <pic:blipFill>
-                    <a:blip r:embed="rId18"/>
+                    <a:blip r:embed="rId20"/>
                     <a:stretch>
                       <a:fillRect/>
                     </a:stretch>
@@ -10970,7 +10970,7 @@
                     <pic:cNvPicPr/>
                   </pic:nvPicPr>
                   <pic:blipFill>
-                    <a:blip r:embed="rId19"/>
+                    <a:blip r:embed="rId21"/>
                     <a:stretch>
                       <a:fillRect/>
                     </a:stretch>
@@ -11194,7 +11194,7 @@
                     <pic:cNvPicPr/>
                   </pic:nvPicPr>
                   <pic:blipFill>
-                    <a:blip r:embed="rId20"/>
+                    <a:blip r:embed="rId22"/>
                     <a:stretch>
                       <a:fillRect/>
                     </a:stretch>
@@ -11299,7 +11299,7 @@
                     <pic:cNvPicPr/>
                   </pic:nvPicPr>
                   <pic:blipFill>
-                    <a:blip r:embed="rId21"/>
+                    <a:blip r:embed="rId23"/>
                     <a:stretch>
                       <a:fillRect/>
                     </a:stretch>
@@ -11416,6 +11416,7 @@
           <w:szCs w:val="26"/>
         </w:rPr>
         <w:sectPr>
+          <w:footerReference w:type="default" r:id="rId24"/>
           <w:pgSz w:w="12240" w:h="15840"/>
           <w:pgMar w:top="1440" w:right="1440" w:bottom="1440" w:left="1440" w:header="720" w:footer="720" w:gutter="0"/>
           <w:cols w:space="720"/>
@@ -11480,7 +11481,7 @@
                     <pic:cNvPicPr/>
                   </pic:nvPicPr>
                   <pic:blipFill>
-                    <a:blip r:embed="rId22"/>
+                    <a:blip r:embed="rId25"/>
                     <a:stretch>
                       <a:fillRect/>
                     </a:stretch>
@@ -23227,6 +23228,7 @@
         <w:rPr>
           <w:b/>
           <w:bCs/>
+          <w:noProof/>
           <w:sz w:val="26"/>
           <w:szCs w:val="26"/>
         </w:rPr>
@@ -23247,7 +23249,7 @@
                     <pic:cNvPicPr/>
                   </pic:nvPicPr>
                   <pic:blipFill>
-                    <a:blip r:embed="rId23"/>
+                    <a:blip r:embed="rId26"/>
                     <a:stretch>
                       <a:fillRect/>
                     </a:stretch>
@@ -24234,6 +24236,7 @@
         <w:rPr>
           <w:b/>
           <w:bCs/>
+          <w:noProof/>
           <w:sz w:val="26"/>
           <w:szCs w:val="26"/>
         </w:rPr>
@@ -24254,7 +24257,7 @@
                     <pic:cNvPicPr/>
                   </pic:nvPicPr>
                   <pic:blipFill>
-                    <a:blip r:embed="rId24"/>
+                    <a:blip r:embed="rId27"/>
                     <a:stretch>
                       <a:fillRect/>
                     </a:stretch>
@@ -24552,6 +24555,7 @@
         <w:rPr>
           <w:b/>
           <w:bCs/>
+          <w:noProof/>
           <w:sz w:val="26"/>
           <w:szCs w:val="26"/>
         </w:rPr>
@@ -24571,7 +24575,7 @@
                     <pic:cNvPicPr/>
                   </pic:nvPicPr>
                   <pic:blipFill>
-                    <a:blip r:embed="rId25"/>
+                    <a:blip r:embed="rId28"/>
                     <a:stretch>
                       <a:fillRect/>
                     </a:stretch>
@@ -24600,24 +24604,14 @@
       <w:r>
         <w:t xml:space="preserve">Hình </w:t>
       </w:r>
-      <w:r>
-        <w:fldChar w:fldCharType="begin"/>
-      </w:r>
-      <w:r>
-        <w:instrText xml:space="preserve"> SEQ Hình \* ARABIC </w:instrText>
-      </w:r>
-      <w:r>
-        <w:fldChar w:fldCharType="separate"/>
-      </w:r>
-      <w:r>
-        <w:rPr>
-          <w:noProof/>
-        </w:rPr>
-        <w:t>19</w:t>
-      </w:r>
-      <w:r>
-        <w:fldChar w:fldCharType="end"/>
-      </w:r>
+      <w:fldSimple w:instr=" SEQ Hình \* ARABIC ">
+        <w:r>
+          <w:rPr>
+            <w:noProof/>
+          </w:rPr>
+          <w:t>19</w:t>
+        </w:r>
+      </w:fldSimple>
       <w:r>
         <w:t>. Luồng xử lý nghiệp vụ tổng quát</w:t>
       </w:r>
@@ -25631,6 +25625,7 @@
         <w:rPr>
           <w:b/>
           <w:bCs/>
+          <w:noProof/>
           <w:sz w:val="26"/>
           <w:szCs w:val="26"/>
         </w:rPr>
@@ -25651,7 +25646,7 @@
                     <pic:cNvPicPr/>
                   </pic:nvPicPr>
                   <pic:blipFill>
-                    <a:blip r:embed="rId26"/>
+                    <a:blip r:embed="rId29"/>
                     <a:stretch>
                       <a:fillRect/>
                     </a:stretch>
@@ -25724,6 +25719,7 @@
       </w:pPr>
       <w:r>
         <w:rPr>
+          <w:noProof/>
           <w:sz w:val="26"/>
           <w:szCs w:val="26"/>
         </w:rPr>
@@ -25744,7 +25740,7 @@
                     <pic:cNvPicPr/>
                   </pic:nvPicPr>
                   <pic:blipFill>
-                    <a:blip r:embed="rId27"/>
+                    <a:blip r:embed="rId30"/>
                     <a:stretch>
                       <a:fillRect/>
                     </a:stretch>
@@ -25837,6 +25833,7 @@
         <w:rPr>
           <w:b/>
           <w:bCs/>
+          <w:noProof/>
           <w:sz w:val="26"/>
           <w:szCs w:val="26"/>
         </w:rPr>
@@ -25857,7 +25854,7 @@
                     <pic:cNvPicPr/>
                   </pic:nvPicPr>
                   <pic:blipFill>
-                    <a:blip r:embed="rId28"/>
+                    <a:blip r:embed="rId31"/>
                     <a:stretch>
                       <a:fillRect/>
                     </a:stretch>
@@ -25907,6 +25904,7 @@
       </w:pPr>
       <w:r>
         <w:rPr>
+          <w:noProof/>
           <w:sz w:val="26"/>
           <w:szCs w:val="26"/>
         </w:rPr>
@@ -25927,7 +25925,7 @@
                     <pic:cNvPicPr/>
                   </pic:nvPicPr>
                   <pic:blipFill>
-                    <a:blip r:embed="rId29"/>
+                    <a:blip r:embed="rId32"/>
                     <a:stretch>
                       <a:fillRect/>
                     </a:stretch>
@@ -25987,6 +25985,7 @@
         <w:rPr>
           <w:b/>
           <w:bCs/>
+          <w:noProof/>
           <w:sz w:val="26"/>
           <w:szCs w:val="26"/>
         </w:rPr>
@@ -26007,7 +26006,7 @@
                     <pic:cNvPicPr/>
                   </pic:nvPicPr>
                   <pic:blipFill>
-                    <a:blip r:embed="rId30"/>
+                    <a:blip r:embed="rId33"/>
                     <a:stretch>
                       <a:fillRect/>
                     </a:stretch>
@@ -26140,6 +26139,131 @@
     </w:sectPr>
   </w:body>
 </w:document>
+</file>
+
+<file path=word/endnotes.xml><?xml version="1.0" encoding="utf-8"?>
+<w:endnotes xmlns:wpc="http://schemas.microsoft.com/office/word/2010/wordprocessingCanvas" xmlns:cx="http://schemas.microsoft.com/office/drawing/2014/chartex" xmlns:cx1="http://schemas.microsoft.com/office/drawing/2015/9/8/chartex" xmlns:cx2="http://schemas.microsoft.com/office/drawing/2015/10/21/chartex" xmlns:cx3="http://schemas.microsoft.com/office/drawing/2016/5/9/chartex" xmlns:cx4="http://schemas.microsoft.com/office/drawing/2016/5/10/chartex" xmlns:cx5="http://schemas.microsoft.com/office/drawing/2016/5/11/chartex" xmlns:cx6="http://schemas.microsoft.com/office/drawing/2016/5/12/chartex" xmlns:cx7="http://schemas.microsoft.com/office/drawing/2016/5/13/chartex" xmlns:cx8="http://schemas.microsoft.com/office/drawing/2016/5/14/chartex" xmlns:mc="http://schemas.openxmlformats.org/markup-compatibility/2006" xmlns:aink="http://schemas.microsoft.com/office/drawing/2016/ink" xmlns:am3d="http://schemas.microsoft.com/office/drawing/2017/model3d" xmlns:o="urn:schemas-microsoft-com:office:office" xmlns:oel="http://schemas.microsoft.com/office/2019/extlst" xmlns:r="http://schemas.openxmlformats.org/officeDocument/2006/relationships" xmlns:m="http://schemas.openxmlformats.org/officeDocument/2006/math" xmlns:v="urn:schemas-microsoft-com:vml" xmlns:wp14="http://schemas.microsoft.com/office/word/2010/wordprocessingDrawing" xmlns:wp="http://schemas.openxmlformats.org/drawingml/2006/wordprocessingDrawing" xmlns:w10="urn:schemas-microsoft-com:office:word" xmlns:w="http://schemas.openxmlformats.org/wordprocessingml/2006/main" xmlns:w14="http://schemas.microsoft.com/office/word/2010/wordml" xmlns:w15="http://schemas.microsoft.com/office/word/2012/wordml" xmlns:w16cex="http://schemas.microsoft.com/office/word/2018/wordml/cex" xmlns:w16cid="http://schemas.microsoft.com/office/word/2016/wordml/cid" xmlns:w16="http://schemas.microsoft.com/office/word/2018/wordml" xmlns:w16du="http://schemas.microsoft.com/office/word/2023/wordml/word16du" xmlns:w16sdtdh="http://schemas.microsoft.com/office/word/2020/wordml/sdtdatahash" xmlns:w16sdtfl="http://schemas.microsoft.com/office/word/2024/wordml/sdtformatlock" xmlns:w16se="http://schemas.microsoft.com/office/word/2015/wordml/symex" xmlns:wpg="http://schemas.microsoft.com/office/word/2010/wordprocessingGroup" xmlns:wpi="http://schemas.microsoft.com/office/word/2010/wordprocessingInk" xmlns:wne="http://schemas.microsoft.com/office/word/2006/wordml" xmlns:wps="http://schemas.microsoft.com/office/word/2010/wordprocessingShape" mc:Ignorable="w14 w15 w16se w16cid w16 w16cex w16sdtdh w16sdtfl w16du wp14">
+  <w:endnote w:type="separator" w:id="-1">
+    <w:p>
+      <w:pPr>
+        <w:spacing w:after="0" w:line="240" w:lineRule="auto"/>
+      </w:pPr>
+      <w:r>
+        <w:separator/>
+      </w:r>
+    </w:p>
+  </w:endnote>
+  <w:endnote w:type="continuationSeparator" w:id="0">
+    <w:p>
+      <w:pPr>
+        <w:spacing w:after="0" w:line="240" w:lineRule="auto"/>
+      </w:pPr>
+      <w:r>
+        <w:continuationSeparator/>
+      </w:r>
+    </w:p>
+  </w:endnote>
+</w:endnotes>
+</file>
+
+<file path=word/footer1.xml><?xml version="1.0" encoding="utf-8"?>
+<w:ftr xmlns:wpc="http://schemas.microsoft.com/office/word/2010/wordprocessingCanvas" xmlns:cx="http://schemas.microsoft.com/office/drawing/2014/chartex" xmlns:cx1="http://schemas.microsoft.com/office/drawing/2015/9/8/chartex" xmlns:cx2="http://schemas.microsoft.com/office/drawing/2015/10/21/chartex" xmlns:cx3="http://schemas.microsoft.com/office/drawing/2016/5/9/chartex" xmlns:cx4="http://schemas.microsoft.com/office/drawing/2016/5/10/chartex" xmlns:cx5="http://schemas.microsoft.com/office/drawing/2016/5/11/chartex" xmlns:cx6="http://schemas.microsoft.com/office/drawing/2016/5/12/chartex" xmlns:cx7="http://schemas.microsoft.com/office/drawing/2016/5/13/chartex" xmlns:cx8="http://schemas.microsoft.com/office/drawing/2016/5/14/chartex" xmlns:mc="http://schemas.openxmlformats.org/markup-compatibility/2006" xmlns:aink="http://schemas.microsoft.com/office/drawing/2016/ink" xmlns:am3d="http://schemas.microsoft.com/office/drawing/2017/model3d" xmlns:o="urn:schemas-microsoft-com:office:office" xmlns:oel="http://schemas.microsoft.com/office/2019/extlst" xmlns:r="http://schemas.openxmlformats.org/officeDocument/2006/relationships" xmlns:m="http://schemas.openxmlformats.org/officeDocument/2006/math" xmlns:v="urn:schemas-microsoft-com:vml" xmlns:wp14="http://schemas.microsoft.com/office/word/2010/wordprocessingDrawing" xmlns:wp="http://schemas.openxmlformats.org/drawingml/2006/wordprocessingDrawing" xmlns:w10="urn:schemas-microsoft-com:office:word" xmlns:w="http://schemas.openxmlformats.org/wordprocessingml/2006/main" xmlns:w14="http://schemas.microsoft.com/office/word/2010/wordml" xmlns:w15="http://schemas.microsoft.com/office/word/2012/wordml" xmlns:w16cex="http://schemas.microsoft.com/office/word/2018/wordml/cex" xmlns:w16cid="http://schemas.microsoft.com/office/word/2016/wordml/cid" xmlns:w16="http://schemas.microsoft.com/office/word/2018/wordml" xmlns:w16du="http://schemas.microsoft.com/office/word/2023/wordml/word16du" xmlns:w16sdtdh="http://schemas.microsoft.com/office/word/2020/wordml/sdtdatahash" xmlns:w16sdtfl="http://schemas.microsoft.com/office/word/2024/wordml/sdtformatlock" xmlns:w16se="http://schemas.microsoft.com/office/word/2015/wordml/symex" xmlns:wpg="http://schemas.microsoft.com/office/word/2010/wordprocessingGroup" xmlns:wpi="http://schemas.microsoft.com/office/word/2010/wordprocessingInk" xmlns:wne="http://schemas.microsoft.com/office/word/2006/wordml" xmlns:wps="http://schemas.microsoft.com/office/word/2010/wordprocessingShape" mc:Ignorable="w14 w15 w16se w16cid w16 w16cex w16sdtdh w16sdtfl w16du wp14">
+  <w:sdt>
+    <w:sdtPr>
+      <w:id w:val="1493453897"/>
+      <w:docPartObj>
+        <w:docPartGallery w:val="Page Numbers (Bottom of Page)"/>
+        <w:docPartUnique/>
+      </w:docPartObj>
+    </w:sdtPr>
+    <w:sdtEndPr>
+      <w:rPr>
+        <w:noProof/>
+        <w:sz w:val="26"/>
+        <w:szCs w:val="26"/>
+      </w:rPr>
+    </w:sdtEndPr>
+    <w:sdtContent>
+      <w:p>
+        <w:pPr>
+          <w:pStyle w:val="Footer"/>
+          <w:jc w:val="center"/>
+          <w:rPr>
+            <w:sz w:val="26"/>
+            <w:szCs w:val="26"/>
+          </w:rPr>
+        </w:pPr>
+        <w:r>
+          <w:rPr>
+            <w:sz w:val="26"/>
+            <w:szCs w:val="26"/>
+          </w:rPr>
+          <w:fldChar w:fldCharType="begin"/>
+        </w:r>
+        <w:r>
+          <w:rPr>
+            <w:sz w:val="26"/>
+            <w:szCs w:val="26"/>
+          </w:rPr>
+          <w:instrText xml:space="preserve"> PAGE   \* MERGEFORMAT </w:instrText>
+        </w:r>
+        <w:r>
+          <w:rPr>
+            <w:sz w:val="26"/>
+            <w:szCs w:val="26"/>
+          </w:rPr>
+          <w:fldChar w:fldCharType="separate"/>
+        </w:r>
+        <w:r>
+          <w:rPr>
+            <w:noProof/>
+            <w:sz w:val="26"/>
+            <w:szCs w:val="26"/>
+          </w:rPr>
+          <w:t>2</w:t>
+        </w:r>
+        <w:r>
+          <w:rPr>
+            <w:noProof/>
+            <w:sz w:val="26"/>
+            <w:szCs w:val="26"/>
+          </w:rPr>
+          <w:fldChar w:fldCharType="end"/>
+        </w:r>
+      </w:p>
+    </w:sdtContent>
+  </w:sdt>
+  <w:p>
+    <w:pPr>
+      <w:pStyle w:val="Footer"/>
+    </w:pPr>
+  </w:p>
+</w:ftr>
+</file>
+
+<file path=word/footnotes.xml><?xml version="1.0" encoding="utf-8"?>
+<w:footnotes xmlns:wpc="http://schemas.microsoft.com/office/word/2010/wordprocessingCanvas" xmlns:cx="http://schemas.microsoft.com/office/drawing/2014/chartex" xmlns:cx1="http://schemas.microsoft.com/office/drawing/2015/9/8/chartex" xmlns:cx2="http://schemas.microsoft.com/office/drawing/2015/10/21/chartex" xmlns:cx3="http://schemas.microsoft.com/office/drawing/2016/5/9/chartex" xmlns:cx4="http://schemas.microsoft.com/office/drawing/2016/5/10/chartex" xmlns:cx5="http://schemas.microsoft.com/office/drawing/2016/5/11/chartex" xmlns:cx6="http://schemas.microsoft.com/office/drawing/2016/5/12/chartex" xmlns:cx7="http://schemas.microsoft.com/office/drawing/2016/5/13/chartex" xmlns:cx8="http://schemas.microsoft.com/office/drawing/2016/5/14/chartex" xmlns:mc="http://schemas.openxmlformats.org/markup-compatibility/2006" xmlns:aink="http://schemas.microsoft.com/office/drawing/2016/ink" xmlns:am3d="http://schemas.microsoft.com/office/drawing/2017/model3d" xmlns:o="urn:schemas-microsoft-com:office:office" xmlns:oel="http://schemas.microsoft.com/office/2019/extlst" xmlns:r="http://schemas.openxmlformats.org/officeDocument/2006/relationships" xmlns:m="http://schemas.openxmlformats.org/officeDocument/2006/math" xmlns:v="urn:schemas-microsoft-com:vml" xmlns:wp14="http://schemas.microsoft.com/office/word/2010/wordprocessingDrawing" xmlns:wp="http://schemas.openxmlformats.org/drawingml/2006/wordprocessingDrawing" xmlns:w10="urn:schemas-microsoft-com:office:word" xmlns:w="http://schemas.openxmlformats.org/wordprocessingml/2006/main" xmlns:w14="http://schemas.microsoft.com/office/word/2010/wordml" xmlns:w15="http://schemas.microsoft.com/office/word/2012/wordml" xmlns:w16cex="http://schemas.microsoft.com/office/word/2018/wordml/cex" xmlns:w16cid="http://schemas.microsoft.com/office/word/2016/wordml/cid" xmlns:w16="http://schemas.microsoft.com/office/word/2018/wordml" xmlns:w16du="http://schemas.microsoft.com/office/word/2023/wordml/word16du" xmlns:w16sdtdh="http://schemas.microsoft.com/office/word/2020/wordml/sdtdatahash" xmlns:w16sdtfl="http://schemas.microsoft.com/office/word/2024/wordml/sdtformatlock" xmlns:w16se="http://schemas.microsoft.com/office/word/2015/wordml/symex" xmlns:wpg="http://schemas.microsoft.com/office/word/2010/wordprocessingGroup" xmlns:wpi="http://schemas.microsoft.com/office/word/2010/wordprocessingInk" xmlns:wne="http://schemas.microsoft.com/office/word/2006/wordml" xmlns:wps="http://schemas.microsoft.com/office/word/2010/wordprocessingShape" mc:Ignorable="w14 w15 w16se w16cid w16 w16cex w16sdtdh w16sdtfl w16du wp14">
+  <w:footnote w:type="separator" w:id="-1">
+    <w:p>
+      <w:pPr>
+        <w:spacing w:after="0" w:line="240" w:lineRule="auto"/>
+      </w:pPr>
+      <w:r>
+        <w:separator/>
+      </w:r>
+    </w:p>
+  </w:footnote>
+  <w:footnote w:type="continuationSeparator" w:id="0">
+    <w:p>
+      <w:pPr>
+        <w:spacing w:after="0" w:line="240" w:lineRule="auto"/>
+      </w:pPr>
+      <w:r>
+        <w:continuationSeparator/>
+      </w:r>
+    </w:p>
+  </w:footnote>
+</w:footnotes>
 </file>
 
 <file path=word/numbering.xml><?xml version="1.0" encoding="utf-8"?>
@@ -27531,6 +27655,7 @@
   <w:style w:type="character" w:default="1" w:styleId="DefaultParagraphFont">
     <w:name w:val="Default Paragraph Font"/>
     <w:uiPriority w:val="1"/>
+    <w:semiHidden/>
     <w:unhideWhenUsed/>
   </w:style>
   <w:style w:type="table" w:default="1" w:styleId="TableNormal">
@@ -27882,6 +28007,50 @@
       <w:szCs w:val="18"/>
     </w:rPr>
   </w:style>
+  <w:style w:type="paragraph" w:styleId="Header">
+    <w:name w:val="header"/>
+    <w:basedOn w:val="Normal"/>
+    <w:link w:val="HeaderChar"/>
+    <w:uiPriority w:val="99"/>
+    <w:unhideWhenUsed/>
+    <w:rsid w:val="007D2192"/>
+    <w:pPr>
+      <w:tabs>
+        <w:tab w:val="center" w:pos="4680"/>
+        <w:tab w:val="right" w:pos="9360"/>
+      </w:tabs>
+      <w:spacing w:after="0" w:line="240" w:lineRule="auto"/>
+    </w:pPr>
+  </w:style>
+  <w:style w:type="character" w:customStyle="1" w:styleId="HeaderChar">
+    <w:name w:val="Header Char"/>
+    <w:basedOn w:val="DefaultParagraphFont"/>
+    <w:link w:val="Header"/>
+    <w:uiPriority w:val="99"/>
+    <w:rsid w:val="007D2192"/>
+  </w:style>
+  <w:style w:type="paragraph" w:styleId="Footer">
+    <w:name w:val="footer"/>
+    <w:basedOn w:val="Normal"/>
+    <w:link w:val="FooterChar"/>
+    <w:uiPriority w:val="99"/>
+    <w:unhideWhenUsed/>
+    <w:rsid w:val="007D2192"/>
+    <w:pPr>
+      <w:tabs>
+        <w:tab w:val="center" w:pos="4680"/>
+        <w:tab w:val="right" w:pos="9360"/>
+      </w:tabs>
+      <w:spacing w:after="0" w:line="240" w:lineRule="auto"/>
+    </w:pPr>
+  </w:style>
+  <w:style w:type="character" w:customStyle="1" w:styleId="FooterChar">
+    <w:name w:val="Footer Char"/>
+    <w:basedOn w:val="DefaultParagraphFont"/>
+    <w:link w:val="Footer"/>
+    <w:uiPriority w:val="99"/>
+    <w:rsid w:val="007D2192"/>
+  </w:style>
 </w:styles>
 </file>
 

</xml_diff>